<commit_message>
BR-002: rename the portal to Speak Up in the emails and documents
The automation email header and footer, the user guide (now v1.2) and
the SLA template say "Speak Up". The sandbox rules and project were
updated from these sources; the portal link is unchanged.

Co-Authored-By: Claude Opus 5.5 <noreply@anthropic.com>
</commit_message>
<xml_diff>
--- a/docs/WB-SLA-Requirements-Template-v1.1.docx
+++ b/docs/WB-SLA-Requirements-Template-v1.1.docx
@@ -142,7 +142,7 @@
                 <w:sz w:val="26"/>
                 <w:szCs w:val="26"/>
               </w:rPr>
-              <w:t xml:space="preserve">Whistleblowing Reporting Portal – targets, levels and escalation, to be completed by ERC</w:t>
+              <w:t xml:space="preserve">Speak Up – targets, levels and escalation, to be completed by ERC</w:t>
             </w:r>
           </w:p>
           <w:p>
@@ -377,7 +377,7 @@
                 <w:sz w:val="18"/>
                 <w:szCs w:val="18"/>
               </w:rPr>
-              <w:t xml:space="preserve">Whistleblowing Reporting Portal (Jira Service Management)</w:t>
+              <w:t xml:space="preserve">Speak Up (Jira Service Management)</w:t>
             </w:r>
           </w:p>
         </w:tc>
@@ -8226,7 +8226,7 @@
         <w:sz w:val="16"/>
         <w:szCs w:val="16"/>
       </w:rPr>
-      <w:t xml:space="preserve">	Whistleblowing Reporting Portal – SLA Requirements Template</w:t>
+      <w:t xml:space="preserve">	Speak Up – SLA Requirements Template</w:t>
     </w:r>
   </w:p>
 </w:hdr>

</xml_diff>